<commit_message>
Draft_018 override: RQ3 100% EC as Working Test consequence; RQ4 ratified-abstracts framing; pro forma tightened
- Part III + Conclusions: 100% Epistemic Caution presented as procedure consequence of Working Test
- RQ4 (and Part IV / Significance / Conclusions) shifted to ratified abstracts at PSAU
- Pro forma kept; explicit that zero-hedge abstracts do not demonstrate non-calibration
- PDF regenerated
</commit_message>
<xml_diff>
--- a/thesis/003_ThesisProposal_Draft_018.docx
+++ b/thesis/003_ThesisProposal_Draft_018.docx
@@ -1029,7 +1029,7 @@
           <w:szCs w:val="22"/>
           <w:rtl w:val="0"/>
         </w:rPr>
-        <w:t xml:space="preserve">4. What do the frequency and functional patterns suggest about the construction of epistemic stance through hedging among developing researchers?</w:t>
+        <w:t>4. What do the frequency and functional patterns suggest about the construction of epistemic stance through hedging in the ratified abstracts of developing researchers at PSAU?</w:t>
       </w:r>
       <w:r>
         <w:rPr>
@@ -1300,15 +1300,15 @@
           <w:bCs w:val="1"/>
           <w:rtl w:val="0"/>
         </w:rPr>
-        <w:t xml:space="preserve">For writing instructors and thesis advisers at PSAU,</w:t>
-      </w:r>
-      <w:r>
-        <w:rPr>
-          <w:b w:val="0"/>
-          <w:bCs w:val="0"/>
-          <w:rtl w:val="0"/>
-        </w:rPr>
-        <w:t xml:space="preserve"> the study provides an empirical baseline of how developing researchers in three applied life sciences programs currently manage uncertainty in abstracts. That baseline can support more targeted feedback than generic advice to “be cautious.”</w:t>
+        <w:t>For writing instructors and thesis advisers at PSAU, the study provides an empirical baseline of how uncertainty is managed in the ratified abstracts of three applied life sciences programs. That baseline can support more targeted feedback than generic advice to “be cautious.”</w:t>
+      </w:r>
+      <w:r>
+        <w:rPr>
+          <w:b w:val="0"/>
+          <w:bCs w:val="0"/>
+          <w:rtl w:val="0"/>
+        </w:rPr>
+        <w:t/>
       </w:r>
       <w:r>
         <w:rPr>
@@ -4200,7 +4200,7 @@
           <w:szCs w:val="22"/>
           <w:rtl w:val="0"/>
         </w:rPr>
-        <w:t xml:space="preserve">This chapter presents the results, analysis, and discussion of the hedging patterns identified in the 60 undergraduate thesis abstracts across Agriculture, Veterinary Medicine, and Biology at Pampanga State Agricultural University. The chapter is organized into four parts, each corresponding to a research question. Part I presents the types of hedging devices found across the three disciplines. Part II examines how hedge frequency varies across Agriculture, Veterinary Medicine, and Biology. Part III identifies the rhetorical functions served by the hedging devices. Part IV discusses what the frequency and functional patterns suggest about the discipline-specific hedging profile of developing researchers.</w:t>
+        <w:t>This chapter presents the results, analysis, and discussion of the hedging patterns identified in the 60 undergraduate thesis abstracts across Agriculture, Veterinary Medicine, and Biology at Pampanga State Agricultural University. The chapter is organized into four parts, each corresponding to a research question. Part I presents the types of hedging devices found across the three disciplines. Part II examines how hedge frequency varies across Agriculture, Veterinary Medicine, and Biology. Part III identifies the rhetorical functions served by the hedging devices. Part IV discusses what the frequency and functional patterns suggest about the discipline-specific hedging profile in the ratified abstracts of developing researchers at PSAU.</w:t>
       </w:r>
       <w:r>
         <w:rPr>
@@ -7812,7 +7812,7 @@
           <w:szCs w:val="22"/>
           <w:rtl w:val="0"/>
         </w:rPr>
-        <w:t xml:space="preserve">All 65 hedge tokens in the corpus served the function of Epistemic Caution (EC). No instances of Politeness/Deference (P) or Discourse Organization </w:t>
+        <w:t>Under the Working Test, only tokens that produced an epistemic effect were retained as hedges. As a direct consequence of that screen, all 65 retained tokens were coded Epistemic Caution (EC). No instances of Politeness/Deference (P) or Discourse Organization (DO) were identified among coded hedges. Discourse connectors such as Hence, Thus, Therefore, and In conclusion appear in the corpus and are tagged (DO) in Appendix C; they organize research moves but do not qualify claims, so they are not counted as hedges. No politeness/deference devices were found. Table 5 presents the function distribution among tokens coded as hedges.</w:t>
       </w:r>
       <w:r>
         <w:rPr>
@@ -7826,20 +7826,20 @@
           <w:rtl w:val="0"/>
           <w:color w:val="00B0F0"/>
         </w:rPr>
-        <w:t xml:space="preserve">(DO)</w:t>
-      </w:r>
-      <w:r>
-        <w:rPr>
-          <w:rFonts w:ascii="Georgia" w:cs="Georgia" w:eastAsia="Georgia" w:hAnsi="Georgia"/>
-          <w:b w:val="0"/>
-          <w:bCs w:val="0"/>
-          <w:i w:val="0"/>
-          <w:iCs w:val="0"/>
-          <w:sz w:val="22"/>
-          <w:szCs w:val="22"/>
-          <w:rtl w:val="0"/>
-        </w:rPr>
-        <w:t xml:space="preserve"> were identified among coded hedges. Discourse connectors such as Hence, Thus, Therefore, and In conclusion appear in the corpus and are tagged (DO) in Appendix C; they organize research moves but do not qualify claims, so they are not counted as hedges. No politeness/deference devices were found. Table 5 presents the function distribution among tokens coded as hedges.</w:t>
+        <w:t/>
+      </w:r>
+      <w:r>
+        <w:rPr>
+          <w:rFonts w:ascii="Georgia" w:cs="Georgia" w:eastAsia="Georgia" w:hAnsi="Georgia"/>
+          <w:b w:val="0"/>
+          <w:bCs w:val="0"/>
+          <w:i w:val="0"/>
+          <w:iCs w:val="0"/>
+          <w:sz w:val="22"/>
+          <w:szCs w:val="22"/>
+          <w:rtl w:val="0"/>
+        </w:rPr>
+        <w:t/>
       </w:r>
       <w:r>
         <w:rPr>
@@ -8519,7 +8519,7 @@
           <w:rFonts w:ascii="Gungsuh" w:cs="Gungsuh" w:eastAsia="Gungsuh" w:hAnsi="Gungsuh"/>
           <w:rtl w:val="0"/>
         </w:rPr>
-        <w:t>Parts I through III show three observable patterns in this corpus. As reported in Part II, an exploratory Kruskal-Wallis test reached p = .033; the chi-square on zero-hedge rates was p = .079, so the labels below are exploratory descriptions of what was observed here, not stable discipline-level characteristics. Generalization beyond this corpus is not warranted. The patterns are read through Salager-Meyer’s (1994) claim-responsibility framework and Hyland’s (2005) stance model.</w:t>
+        <w:t>Parts I through III show three observable patterns in the ratified abstracts in this corpus. As reported in Part II, an exploratory Kruskal-Wallis test reached p = .033; the chi-square on zero-hedge rates was p = .079, so the labels below are exploratory descriptions of what was observed here, not stable discipline-level characteristics. Generalization beyond this corpus is not warranted. The patterns are read through Salager-Meyer’s (1994) claim-responsibility framework and Hyland’s (2005) stance model.</w:t>
       </w:r>
     </w:p>
     <w:p>
@@ -8677,7 +8677,7 @@
         <w:rPr>
           <w:rtl w:val="0"/>
         </w:rPr>
-        <w:t>Three observations support a descriptive label of pro forma hedging, not a confirmed construct: (1) potential accounts for a large share of lexical hedges and recurs in near-identical frames (Part I); (2) all retained hedges serve a single function (Part III); (3) 25 of 60 abstracts contain no hedges at all (Part II). These tokens are counted as hedges by form, position, and Working Test. “Pro forma” describes how they behave in the corpus (formulaic frames, single function, limited commitment calibration), not a claim that they fail the Working Test or should be excluded from density. When hedging appears, it often looks formulaic—a limited set of frames and one function—rather than finely calibrated stance. The label aligns with Demir’s (2018) account of L2 underuse and Petchkij’s (2019) observation that instruction can raise frequency without fully expanding functional range. It remains a hypothesis for replication with inter-rater coding and expert-abstract comparison.</w:t>
+        <w:t>Three observations support a descriptive label of pro forma hedging, not a confirmed construct: (1) potential accounts for a large share of lexical hedges and recurs in near-identical frames (Part I); (2) all retained hedges serve a single function under the Working Test (Part III); (3) 25 of 60 abstracts contain no coded hedges (Part II). These tokens are counted as hedges by form, position, and Working Test. “Pro forma” describes how the retained tokens behave in this corpus (formulaic frames, single function, limited commitment calibration). It does not claim that zero-hedge abstracts themselves demonstrate non-calibration, nor that the tokens fail the Working Test or should be excluded from density. When hedging appears, it often looks formulaic—a limited set of frames and one function—rather than finely calibrated stance. The label aligns with Demir’s (2018) account of L2 underuse and Petchkij’s (2019) observation that instruction can raise frequency without fully expanding functional range. It remains a hypothesis for replication with inter-rater coding and expert-abstract comparison.</w:t>
       </w:r>
     </w:p>
     <w:p>
@@ -8778,7 +8778,7 @@
           <w:szCs w:val="22"/>
           <w:rtl w:val="0"/>
         </w:rPr>
-        <w:t>Lexical hedges outnumber modal verbs in this corpus, largely because of formulaic potential. Density is highest in Agriculture and Biology (near-tied), then Veterinary Medicine, with 25 of 60 abstracts (41.7%) containing no coded hedges. Every retained hedge was coded as Epistemic Caution. Full counts and tests are reported in Parts I–III.</w:t>
+        <w:t>Lexical hedges outnumber modal verbs in this corpus, largely because of formulaic potential. Density is highest in Agriculture and Biology (near-tied), then Veterinary Medicine, with 25 of 60 abstracts (41.7%) containing no coded hedges. Under the Working Test, every retained hedge was coded as Epistemic Caution; the uniform function assignment is therefore partly a consequence of the identification screen. Full counts and tests are reported in Parts I–III.</w:t>
       </w:r>
       <w:r>
         <w:rPr>
@@ -8804,7 +8804,7 @@
           <w:szCs w:val="22"/>
           <w:rtl w:val="0"/>
         </w:rPr>
-        <w:t>Disciplinary differentiation is present but uneven. Veterinary Medicine’s sparse, assertive profile is the clearest contrast. Agriculture’s edge over Biology is modest and outlier-sensitive. The patterns are consistent with field-specific epistemic demands (Salager-Meyer, 1994) among developing writers, but statistical evidence is exploratory (Kruskal-Wallis p = .033) and the sample is small. The study provides a local baseline, not a general law.</w:t>
+        <w:t>Disciplinary differentiation is present but uneven. Veterinary Medicine’s sparse, assertive profile is the clearest contrast. Agriculture’s edge over Biology is modest and outlier-sensitive. The patterns are consistent with field-specific epistemic demands (Salager-Meyer, 1994) in these ratified abstracts, but statistical evidence is exploratory (Kruskal-Wallis p = .033) and the sample is small. The study provides a local baseline, not a general law.</w:t>
       </w:r>
       <w:r>
         <w:rPr>

</xml_diff>

<commit_message>
Draft_018: strip leftover teal color from (DO) in Appendix C opening paragraph
</commit_message>
<xml_diff>
--- a/thesis/003_ThesisProposal_Draft_018.docx
+++ b/thesis/003_ThesisProposal_Draft_018.docx
@@ -8230,20 +8230,7 @@
                 <w:szCs w:val="18"/>
                 <w:rtl w:val="0"/>
               </w:rPr>
-              <w:t xml:space="preserve">Discourse Organization </w:t>
-            </w:r>
-            <w:r>
-              <w:rPr>
-                <w:rFonts w:ascii="Georgia" w:cs="Georgia" w:eastAsia="Georgia" w:hAnsi="Georgia"/>
-                <w:b w:val="0"/>
-                <w:bCs w:val="0"/>
-                <w:i w:val="0"/>
-                <w:iCs w:val="0"/>
-                <w:sz w:val="18"/>
-                <w:szCs w:val="18"/>
-                <w:rtl w:val="0"/>
-              </w:rPr>
-              <w:t xml:space="preserve">(DO)</w:t>
+              <w:t>Discourse Organization (DO)</w:t>
             </w:r>
             <w:r>
               <w:rPr>
@@ -18592,7 +18579,6 @@
           <w:sz w:val="22"/>
           <w:szCs w:val="22"/>
           <w:rtl w:val="0"/>
-          <w:color w:val="00B0F0"/>
         </w:rPr>
         <w:t xml:space="preserve">(DO)</w:t>
       </w:r>

</xml_diff>